<commit_message>
Update translation content and metadata for 1969 files across multiple languages
</commit_message>
<xml_diff>
--- a/hin/docx/037.content.docx
+++ b/hin/docx/037.content.docx
@@ -1016,24 +1016,13 @@
         </w:rPr>
         <w:t>प्रचार करते रहे</w:t>
       </w:r>
-    </w:p>
-    <w:tbl>
-      <w:tblPr>
-        <w:tblW w:type="auto" w:w="0"/>
-        <w:tblLook w:firstColumn="1" w:firstRow="1" w:lastColumn="0" w:lastRow="0" w:noHBand="0" w:noVBand="1" w:val="04A0"/>
-      </w:tblPr>
-      <w:tblGrid>
-        <w:gridCol w:w="9360"/>
-      </w:tblGrid>
-      <w:tr>
-        <w:tc>
-          <w:tcPr>
-            <w:tcW w:type="dxa" w:w="9360"/>
-          </w:tcPr>
-          <w:p/>
-        </w:tc>
-      </w:tr>
-    </w:tbl>
+      <w:r>
+        <w:rPr>
+          <w:lang w:val="hi_IN" w:bidi="hi_IN"/>
+        </w:rPr>
+        <w:t>|</w:t>
+      </w:r>
+    </w:p>
     <w:p>
       <w:pPr>
         <w:pStyle w:val="ListBullet"/>

</xml_diff>